<commit_message>
feature: get mou applications of an organization feedback: add mou_detail duration
</commit_message>
<xml_diff>
--- a/mou_templates/mou_local.docx
+++ b/mou_templates/mou_local.docx
@@ -227,39 +227,8 @@
         <w:rPr>
           <w:b/>
           <w:caps/>
-          <w:highlight w:val="yellow"/>
-        </w:rPr>
-        <w:t>[</w:t>
-      </w:r>
-      <w:r>
-        <w:rPr>
-          <w:b/>
-          <w:caps/>
-          <w:highlight w:val="yellow"/>
-        </w:rPr>
-        <w:t xml:space="preserve"> </w:t>
-      </w:r>
-      <w:r>
-        <w:rPr>
-          <w:b/>
-          <w:caps/>
-          <w:highlight w:val="yellow"/>
-        </w:rPr>
-        <w:t>proposed institution</w:t>
-      </w:r>
-      <w:r>
-        <w:rPr>
-          <w:b/>
-          <w:caps/>
-        </w:rPr>
-        <w:t>………………………………</w:t>
-      </w:r>
-      <w:r>
-        <w:rPr>
-          <w:b/>
-          <w:caps/>
-        </w:rPr>
-        <w:t>]</w:t>
+        </w:rPr>
+        <w:t>{ORGANIZATION_NAME}</w:t>
       </w:r>
     </w:p>
     <w:p>
@@ -967,7 +936,10 @@
         <w:jc w:val="both"/>
       </w:pPr>
       <w:r>
-        <w:t>P.O. Box ……………</w:t>
+        <w:t xml:space="preserve">P.O. Box </w:t>
+      </w:r>
+      <w:r>
+        <w:t>{ORGANIZATION_PO_BOX}</w:t>
       </w:r>
     </w:p>
     <w:p>
@@ -1007,27 +979,33 @@
         <w:rPr>
           <w:lang w:val="en-GB"/>
         </w:rPr>
-        <w:t>Fix and Mobile Phone: …</w:t>
-      </w:r>
-      <w:r>
-        <w:rPr>
-          <w:lang w:val="en-GB"/>
-        </w:rPr>
-        <w:t>…...</w:t>
-      </w:r>
-    </w:p>
-    <w:p>
-      <w:pPr>
-        <w:jc w:val="both"/>
-        <w:rPr>
-          <w:lang w:val="en-GB"/>
-        </w:rPr>
-      </w:pPr>
-      <w:r>
-        <w:rPr>
-          <w:lang w:val="en-GB"/>
-        </w:rPr>
-        <w:t>Address: …………………….</w:t>
+        <w:t xml:space="preserve">Fix and Mobile Phone: </w:t>
+      </w:r>
+      <w:r>
+        <w:rPr>
+          <w:lang w:val="en-GB"/>
+        </w:rPr>
+        <w:t>{ORGANIZATION_PHONE}</w:t>
+      </w:r>
+    </w:p>
+    <w:p>
+      <w:pPr>
+        <w:jc w:val="both"/>
+        <w:rPr>
+          <w:lang w:val="en-GB"/>
+        </w:rPr>
+      </w:pPr>
+      <w:r>
+        <w:rPr>
+          <w:lang w:val="en-GB"/>
+        </w:rPr>
+        <w:t xml:space="preserve">Address: </w:t>
+      </w:r>
+      <w:r>
+        <w:rPr>
+          <w:lang w:val="en-GB"/>
+        </w:rPr>
+        <w:t>{ORGANIZATION_ADDRESS}</w:t>
       </w:r>
     </w:p>
     <w:p>
@@ -1041,35 +1019,33 @@
         <w:rPr>
           <w:lang w:val="en-GB"/>
         </w:rPr>
-        <w:t>Email: ………………………</w:t>
-      </w:r>
-      <w:r>
-        <w:rPr>
-          <w:lang w:val="en-GB"/>
-        </w:rPr>
-        <w:t>.</w:t>
-      </w:r>
-    </w:p>
-    <w:p>
-      <w:pPr>
-        <w:jc w:val="both"/>
-        <w:rPr>
-          <w:lang w:val="en-GB"/>
-        </w:rPr>
-      </w:pPr>
-      <w:proofErr w:type="gramStart"/>
-      <w:r>
-        <w:rPr>
-          <w:lang w:val="en-GB"/>
-        </w:rPr>
-        <w:t>Website:…</w:t>
-      </w:r>
-      <w:proofErr w:type="gramEnd"/>
-      <w:r>
-        <w:rPr>
-          <w:lang w:val="en-GB"/>
-        </w:rPr>
-        <w:t>…………………..</w:t>
+        <w:t xml:space="preserve">Email: </w:t>
+      </w:r>
+      <w:r>
+        <w:rPr>
+          <w:lang w:val="en-GB"/>
+        </w:rPr>
+        <w:t>{ORGANIZATION_EMAIL}</w:t>
+      </w:r>
+    </w:p>
+    <w:p>
+      <w:pPr>
+        <w:jc w:val="both"/>
+        <w:rPr>
+          <w:lang w:val="en-GB"/>
+        </w:rPr>
+      </w:pPr>
+      <w:r>
+        <w:rPr>
+          <w:lang w:val="en-GB"/>
+        </w:rPr>
+        <w:t>Website:</w:t>
+      </w:r>
+      <w:r>
+        <w:rPr>
+          <w:lang w:val="en-GB"/>
+        </w:rPr>
+        <w:t xml:space="preserve"> {ORGANIZATION_WEBSITE}</w:t>
       </w:r>
     </w:p>
     <w:p>
@@ -1307,60 +1283,20 @@
         <w:jc w:val="both"/>
       </w:pPr>
       <w:r>
+        <w:lastRenderedPageBreak/>
         <w:t>T</w:t>
       </w:r>
       <w:r>
         <w:rPr>
           <w:lang w:val="en-GB"/>
         </w:rPr>
-        <w:t xml:space="preserve">he Ministry of Health </w:t>
-      </w:r>
-      <w:proofErr w:type="gramStart"/>
-      <w:r>
-        <w:rPr>
-          <w:lang w:val="en-GB"/>
-        </w:rPr>
-        <w:t xml:space="preserve">and </w:t>
-      </w:r>
-      <w:r>
-        <w:rPr>
-          <w:lang w:val="en-GB"/>
-        </w:rPr>
-        <w:t>.</w:t>
-      </w:r>
-      <w:proofErr w:type="gramEnd"/>
-      <w:r>
-        <w:rPr>
-          <w:highlight w:val="yellow"/>
-          <w:lang w:val="en-GB"/>
-        </w:rPr>
-        <w:t>[</w:t>
-      </w:r>
-      <w:r>
-        <w:rPr>
-          <w:highlight w:val="yellow"/>
-          <w:lang w:val="en-GB"/>
-        </w:rPr>
-        <w:t xml:space="preserve"> </w:t>
-      </w:r>
-      <w:r>
-        <w:rPr>
-          <w:highlight w:val="yellow"/>
-          <w:lang w:val="en-GB"/>
-        </w:rPr>
-        <w:t>proposed institution</w:t>
-      </w:r>
-      <w:r>
-        <w:rPr>
-          <w:lang w:val="en-GB"/>
-        </w:rPr>
-        <w:t>......................</w:t>
-      </w:r>
-      <w:r>
-        <w:rPr>
-          <w:lang w:val="en-GB"/>
-        </w:rPr>
-        <w:t>]</w:t>
+        <w:t>he Ministry of Health and</w:t>
+      </w:r>
+      <w:r>
+        <w:rPr>
+          <w:lang w:val="en-GB"/>
+        </w:rPr>
+        <w:t xml:space="preserve"> {ORGANIZATION_NAME}</w:t>
       </w:r>
       <w:r>
         <w:rPr>
@@ -1381,7 +1317,7 @@
         <w:t xml:space="preserve">partnership/collaboration in </w:t>
       </w:r>
       <w:r>
-        <w:t>……………………………………..</w:t>
+        <w:t>{PROJECT_NAME}</w:t>
       </w:r>
     </w:p>
     <w:p>
@@ -1404,7 +1340,7 @@
     </w:p>
     <w:p>
       <w:pPr>
-        <w:pStyle w:val="MediumGrid1-Accent2"/>
+        <w:pStyle w:val="MediumGrid1-Accent21"/>
         <w:numPr>
           <w:ilvl w:val="0"/>
           <w:numId w:val="5"/>
@@ -1705,15 +1641,7 @@
         <w:t xml:space="preserve">The overall goal for this project is </w:t>
       </w:r>
       <w:r>
-        <w:t>…………………………………………………</w:t>
-      </w:r>
-      <w:proofErr w:type="gramStart"/>
-      <w:r>
-        <w:t>…..</w:t>
-      </w:r>
-      <w:proofErr w:type="gramEnd"/>
-      <w:r>
-        <w:t>and specific objectives are:</w:t>
+        <w:t>……………………………………………………..and specific objectives are:</w:t>
       </w:r>
       <w:r>
         <w:t xml:space="preserve"> </w:t>
@@ -1923,13 +1851,8 @@
         <w:jc w:val="both"/>
       </w:pPr>
       <w:r>
-        <w:t>To ………………………</w:t>
-      </w:r>
-      <w:proofErr w:type="gramStart"/>
-      <w:r>
-        <w:t>…..</w:t>
-      </w:r>
-      <w:proofErr w:type="gramEnd"/>
+        <w:t>To …………………………..</w:t>
+      </w:r>
     </w:p>
     <w:p>
       <w:pPr>
@@ -1943,15 +1866,7 @@
         <w:t>To provide supervision and</w:t>
       </w:r>
       <w:r>
-        <w:t xml:space="preserve"> inform [Proposed institution</w:t>
-      </w:r>
-      <w:proofErr w:type="gramStart"/>
-      <w:r>
-        <w:t>…..</w:t>
-      </w:r>
-      <w:proofErr w:type="gramEnd"/>
-      <w:r>
-        <w:t>] of any concerns or changes in the National Health Policy where ………….. [partner’s area of intervention] are concerned.</w:t>
+        <w:t xml:space="preserve"> inform [Proposed institution…..] of any concerns or changes in the National Health Policy where ………….. [partner’s area of intervention] are concerned.</w:t>
       </w:r>
     </w:p>
     <w:p>
@@ -2055,6 +1970,7 @@
           <w:bCs/>
           <w:szCs w:val="24"/>
         </w:rPr>
+        <w:lastRenderedPageBreak/>
         <w:t xml:space="preserve">Responsibilities of </w:t>
       </w:r>
       <w:r>
@@ -2101,148 +2017,116 @@
           <w:szCs w:val="24"/>
           <w:highlight w:val="yellow"/>
         </w:rPr>
-        <w:t xml:space="preserve">and fill </w:t>
-      </w:r>
-      <w:proofErr w:type="gramStart"/>
+        <w:t>and fill responsibilities part</w:t>
+      </w:r>
       <w:r>
         <w:rPr>
           <w:bCs/>
           <w:szCs w:val="24"/>
+        </w:rPr>
+        <w:t>]</w:t>
+      </w:r>
+      <w:r>
+        <w:rPr>
+          <w:bCs/>
+          <w:szCs w:val="24"/>
+        </w:rPr>
+        <w:t xml:space="preserve"> </w:t>
+      </w:r>
+    </w:p>
+    <w:p/>
+    <w:p>
+      <w:pPr>
+        <w:pStyle w:val="MediumGrid1-Accent21"/>
+        <w:ind w:left="0"/>
+        <w:jc w:val="both"/>
+      </w:pPr>
+      <w:r>
+        <w:rPr>
+          <w:b/>
+        </w:rPr>
+        <w:t xml:space="preserve">The responsibilities of [propose institution, and fill responsibilities </w:t>
+      </w:r>
+      <w:r>
+        <w:rPr>
+          <w:b/>
+        </w:rPr>
+        <w:t>part] are as follows:</w:t>
+      </w:r>
+      <w:r>
+        <w:t xml:space="preserve"> </w:t>
+      </w:r>
+      <w:r>
+        <w:sym w:font="Wingdings" w:char="F0E8"/>
+      </w:r>
+      <w:r>
+        <w:t>Here you have to provide detailed activities</w:t>
+      </w:r>
+    </w:p>
+    <w:p>
+      <w:pPr>
+        <w:pStyle w:val="MediumGrid1-Accent21"/>
+        <w:jc w:val="both"/>
+      </w:pPr>
+    </w:p>
+    <w:p>
+      <w:pPr>
+        <w:pStyle w:val="MediumGrid1-Accent21"/>
+        <w:ind w:left="0"/>
+        <w:jc w:val="both"/>
+      </w:pPr>
+      <w:r>
+        <w:t>To</w:t>
+      </w:r>
+      <w:r>
+        <w:t>..........................................................................</w:t>
+      </w:r>
+    </w:p>
+    <w:p>
+      <w:pPr>
+        <w:pStyle w:val="MediumGrid1-Accent21"/>
+        <w:jc w:val="both"/>
+      </w:pPr>
+      <w:r>
+        <w:t xml:space="preserve">  </w:t>
+      </w:r>
+    </w:p>
+    <w:p>
+      <w:pPr>
+        <w:pStyle w:val="MediumGrid1-Accent21"/>
+        <w:ind w:left="0"/>
+        <w:jc w:val="both"/>
+      </w:pPr>
+      <w:r>
+        <w:t>To</w:t>
+      </w:r>
+      <w:r>
+        <w:t>.............................................................................</w:t>
+      </w:r>
+    </w:p>
+    <w:p>
+      <w:pPr>
+        <w:pStyle w:val="MediumGrid1-Accent21"/>
+        <w:ind w:left="0"/>
+        <w:jc w:val="both"/>
+      </w:pPr>
+      <w:r>
+        <w:t>To</w:t>
+      </w:r>
+      <w:r>
+        <w:t>............................................................................</w:t>
+      </w:r>
+    </w:p>
+    <w:p>
+      <w:pPr>
+        <w:pStyle w:val="MediumGrid1-Accent21"/>
+        <w:ind w:left="0"/>
+        <w:jc w:val="both"/>
+      </w:pPr>
+      <w:r>
+        <w:rPr>
           <w:highlight w:val="yellow"/>
         </w:rPr>
-        <w:t>responsibilities</w:t>
-      </w:r>
-      <w:proofErr w:type="gramEnd"/>
-      <w:r>
-        <w:rPr>
-          <w:bCs/>
-          <w:szCs w:val="24"/>
-          <w:highlight w:val="yellow"/>
-        </w:rPr>
-        <w:t xml:space="preserve"> part</w:t>
-      </w:r>
-      <w:r>
-        <w:rPr>
-          <w:bCs/>
-          <w:szCs w:val="24"/>
-        </w:rPr>
-        <w:t>]</w:t>
-      </w:r>
-      <w:r>
-        <w:rPr>
-          <w:bCs/>
-          <w:szCs w:val="24"/>
-        </w:rPr>
-        <w:t xml:space="preserve"> </w:t>
-      </w:r>
-    </w:p>
-    <w:p/>
-    <w:p>
-      <w:pPr>
-        <w:pStyle w:val="MediumGrid1-Accent2"/>
-        <w:ind w:left="0"/>
-        <w:jc w:val="both"/>
-      </w:pPr>
-      <w:r>
-        <w:rPr>
-          <w:b/>
-        </w:rPr>
-        <w:t xml:space="preserve">The responsibilities of [propose institution, and fill </w:t>
-      </w:r>
-      <w:proofErr w:type="gramStart"/>
-      <w:r>
-        <w:rPr>
-          <w:b/>
-        </w:rPr>
-        <w:t>responsibilities</w:t>
-      </w:r>
-      <w:proofErr w:type="gramEnd"/>
-      <w:r>
-        <w:rPr>
-          <w:b/>
-        </w:rPr>
-        <w:t xml:space="preserve"> </w:t>
-      </w:r>
-      <w:r>
-        <w:rPr>
-          <w:b/>
-        </w:rPr>
-        <w:t>part] are as follows:</w:t>
-      </w:r>
-      <w:r>
-        <w:t xml:space="preserve"> </w:t>
-      </w:r>
-      <w:r>
-        <w:sym w:font="Wingdings" w:char="F0E8"/>
-      </w:r>
-      <w:r>
-        <w:t>Here you have to provide detailed activities</w:t>
-      </w:r>
-    </w:p>
-    <w:p>
-      <w:pPr>
-        <w:pStyle w:val="MediumGrid1-Accent2"/>
-        <w:jc w:val="both"/>
-      </w:pPr>
-    </w:p>
-    <w:p>
-      <w:pPr>
-        <w:pStyle w:val="MediumGrid1-Accent2"/>
-        <w:ind w:left="0"/>
-        <w:jc w:val="both"/>
-      </w:pPr>
-      <w:r>
-        <w:t>To</w:t>
-      </w:r>
-      <w:r>
-        <w:t>..........................................................................</w:t>
-      </w:r>
-    </w:p>
-    <w:p>
-      <w:pPr>
-        <w:pStyle w:val="MediumGrid1-Accent2"/>
-        <w:jc w:val="both"/>
-      </w:pPr>
-      <w:r>
-        <w:t xml:space="preserve">  </w:t>
-      </w:r>
-    </w:p>
-    <w:p>
-      <w:pPr>
-        <w:pStyle w:val="MediumGrid1-Accent2"/>
-        <w:ind w:left="0"/>
-        <w:jc w:val="both"/>
-      </w:pPr>
-      <w:r>
-        <w:t>To</w:t>
-      </w:r>
-      <w:r>
-        <w:t>.............................................................................</w:t>
-      </w:r>
-    </w:p>
-    <w:p>
-      <w:pPr>
-        <w:pStyle w:val="MediumGrid1-Accent2"/>
-        <w:ind w:left="0"/>
-        <w:jc w:val="both"/>
-      </w:pPr>
-      <w:r>
-        <w:t>To</w:t>
-      </w:r>
-      <w:r>
-        <w:t>............................................................................</w:t>
-      </w:r>
-    </w:p>
-    <w:p>
-      <w:pPr>
-        <w:pStyle w:val="MediumGrid1-Accent2"/>
-        <w:ind w:left="0"/>
-        <w:jc w:val="both"/>
-      </w:pPr>
-      <w:r>
-        <w:rPr>
-          <w:highlight w:val="yellow"/>
-        </w:rPr>
         <w:t>[Proposed institution</w:t>
       </w:r>
       <w:r>
@@ -2251,13 +2135,13 @@
     </w:p>
     <w:p>
       <w:pPr>
-        <w:pStyle w:val="MediumGrid1-Accent2"/>
-        <w:jc w:val="both"/>
-      </w:pPr>
-    </w:p>
-    <w:p>
-      <w:pPr>
-        <w:pStyle w:val="MediumGrid1-Accent2"/>
+        <w:pStyle w:val="MediumGrid1-Accent21"/>
+        <w:jc w:val="both"/>
+      </w:pPr>
+    </w:p>
+    <w:p>
+      <w:pPr>
+        <w:pStyle w:val="MediumGrid1-Accent21"/>
         <w:numPr>
           <w:ilvl w:val="0"/>
           <w:numId w:val="5"/>
@@ -2279,7 +2163,7 @@
     </w:p>
     <w:p>
       <w:pPr>
-        <w:pStyle w:val="MediumGrid1-Accent2"/>
+        <w:pStyle w:val="MediumGrid1-Accent21"/>
         <w:contextualSpacing/>
         <w:jc w:val="both"/>
         <w:rPr>
@@ -2511,7 +2395,7 @@
     </w:p>
     <w:p>
       <w:pPr>
-        <w:pStyle w:val="MediumGrid1-Accent2"/>
+        <w:pStyle w:val="MediumGrid1-Accent21"/>
         <w:jc w:val="both"/>
         <w:rPr>
           <w:rStyle w:val="Bold"/>
@@ -2525,7 +2409,7 @@
     </w:p>
     <w:p>
       <w:pPr>
-        <w:pStyle w:val="MediumGrid1-Accent2"/>
+        <w:pStyle w:val="MediumGrid1-Accent21"/>
         <w:jc w:val="both"/>
         <w:rPr>
           <w:rStyle w:val="Bold"/>
@@ -2539,7 +2423,7 @@
     </w:p>
     <w:p>
       <w:pPr>
-        <w:pStyle w:val="MediumGrid1-Accent2"/>
+        <w:pStyle w:val="MediumGrid1-Accent21"/>
         <w:jc w:val="both"/>
         <w:rPr>
           <w:rStyle w:val="Bold"/>
@@ -2553,7 +2437,7 @@
     </w:p>
     <w:p>
       <w:pPr>
-        <w:pStyle w:val="MediumGrid1-Accent2"/>
+        <w:pStyle w:val="MediumGrid1-Accent21"/>
         <w:jc w:val="both"/>
         <w:rPr>
           <w:rStyle w:val="Bold"/>
@@ -2567,7 +2451,7 @@
     </w:p>
     <w:p>
       <w:pPr>
-        <w:pStyle w:val="MediumGrid1-Accent2"/>
+        <w:pStyle w:val="MediumGrid1-Accent21"/>
         <w:numPr>
           <w:ilvl w:val="0"/>
           <w:numId w:val="5"/>
@@ -2606,6 +2490,7 @@
         <w:jc w:val="both"/>
       </w:pPr>
       <w:r>
+        <w:lastRenderedPageBreak/>
         <w:t xml:space="preserve">This </w:t>
       </w:r>
       <w:r>
@@ -5212,8 +5097,8 @@
     <w:lsdException w:name="Plain Table 5" w:uiPriority="31" w:qFormat="1"/>
     <w:lsdException w:name="Grid Table Light" w:uiPriority="32" w:qFormat="1"/>
     <w:lsdException w:name="Grid Table 1 Light" w:uiPriority="33" w:qFormat="1"/>
-    <w:lsdException w:name="Grid Table 2" w:semiHidden="1" w:uiPriority="37" w:unhideWhenUsed="1"/>
-    <w:lsdException w:name="Grid Table 3" w:semiHidden="1" w:uiPriority="39" w:unhideWhenUsed="1" w:qFormat="1"/>
+    <w:lsdException w:name="Grid Table 2" w:uiPriority="37"/>
+    <w:lsdException w:name="Grid Table 3" w:uiPriority="39" w:qFormat="1"/>
     <w:lsdException w:name="Grid Table 4" w:uiPriority="49"/>
     <w:lsdException w:name="Grid Table 5 Dark" w:uiPriority="50"/>
     <w:lsdException w:name="Grid Table 6 Colorful" w:uiPriority="51"/>
@@ -5388,7 +5273,6 @@
     <w:uiPriority w:val="99"/>
     <w:semiHidden/>
     <w:unhideWhenUsed/>
-    <w:qFormat/>
     <w:tblPr>
       <w:tblInd w:w="0" w:type="dxa"/>
       <w:tblCellMar>
@@ -5662,8 +5546,8 @@
       <w:lang w:val="en-GB"/>
     </w:rPr>
   </w:style>
-  <w:style w:type="paragraph" w:styleId="MediumGrid1-Accent2">
-    <w:name w:val="Medium Grid 1 Accent 2"/>
+  <w:style w:type="paragraph" w:customStyle="1" w:styleId="MediumGrid1-Accent21">
+    <w:name w:val="Medium Grid 1 - Accent 21"/>
     <w:basedOn w:val="Normal"/>
     <w:uiPriority w:val="72"/>
     <w:qFormat/>

</xml_diff>

<commit_message>
feedback: return domain organizations as an array
</commit_message>
<xml_diff>
--- a/mou_templates/mou_local.docx
+++ b/mou_templates/mou_local.docx
@@ -1230,7 +1230,6 @@
         <w:jc w:val="both"/>
       </w:pPr>
       <w:r>
-        <w:lastRenderedPageBreak/>
         <w:t>T</w:t>
       </w:r>
       <w:r>
@@ -1287,7 +1286,7 @@
     </w:p>
     <w:p>
       <w:pPr>
-        <w:pStyle w:val="MediumGrid1-Accent2"/>
+        <w:pStyle w:val="MediumGrid1-Accent21"/>
         <w:numPr>
           <w:ilvl w:val="0"/>
           <w:numId w:val="5"/>
@@ -1933,7 +1932,7 @@
     <w:p/>
     <w:p>
       <w:pPr>
-        <w:pStyle w:val="MediumGrid1-Accent2"/>
+        <w:pStyle w:val="MediumGrid1-Accent21"/>
         <w:ind w:left="0"/>
         <w:jc w:val="both"/>
       </w:pPr>
@@ -1961,14 +1960,14 @@
     </w:p>
     <w:p>
       <w:pPr>
-        <w:pStyle w:val="MediumGrid1-Accent2"/>
+        <w:pStyle w:val="MediumGrid1-Accent21"/>
         <w:ind w:left="0"/>
         <w:jc w:val="both"/>
       </w:pPr>
     </w:p>
     <w:p>
       <w:pPr>
-        <w:pStyle w:val="MediumGrid1-Accent2"/>
+        <w:pStyle w:val="MediumGrid1-Accent21"/>
         <w:ind w:left="0"/>
         <w:jc w:val="both"/>
       </w:pPr>
@@ -1978,12 +1977,11 @@
     </w:p>
     <w:p>
       <w:pPr>
-        <w:pStyle w:val="MediumGrid1-Accent2"/>
+        <w:pStyle w:val="MediumGrid1-Accent21"/>
         <w:ind w:left="0"/>
         <w:jc w:val="both"/>
       </w:pPr>
       <w:r>
-        <w:lastRenderedPageBreak/>
         <w:t xml:space="preserve">{ORGANIZATION_NAME} </w:t>
       </w:r>
       <w:r>
@@ -1992,13 +1990,13 @@
     </w:p>
     <w:p>
       <w:pPr>
-        <w:pStyle w:val="MediumGrid1-Accent2"/>
-        <w:jc w:val="both"/>
-      </w:pPr>
-    </w:p>
-    <w:p>
-      <w:pPr>
-        <w:pStyle w:val="MediumGrid1-Accent2"/>
+        <w:pStyle w:val="MediumGrid1-Accent21"/>
+        <w:jc w:val="both"/>
+      </w:pPr>
+    </w:p>
+    <w:p>
+      <w:pPr>
+        <w:pStyle w:val="MediumGrid1-Accent21"/>
         <w:numPr>
           <w:ilvl w:val="0"/>
           <w:numId w:val="5"/>
@@ -2020,7 +2018,7 @@
     </w:p>
     <w:p>
       <w:pPr>
-        <w:pStyle w:val="MediumGrid1-Accent2"/>
+        <w:pStyle w:val="MediumGrid1-Accent21"/>
         <w:contextualSpacing/>
         <w:jc w:val="both"/>
         <w:rPr>
@@ -2261,7 +2259,7 @@
     </w:p>
     <w:p>
       <w:pPr>
-        <w:pStyle w:val="MediumGrid1-Accent2"/>
+        <w:pStyle w:val="MediumGrid1-Accent21"/>
         <w:jc w:val="both"/>
         <w:rPr>
           <w:rStyle w:val="Bold"/>
@@ -2275,7 +2273,7 @@
     </w:p>
     <w:p>
       <w:pPr>
-        <w:pStyle w:val="MediumGrid1-Accent2"/>
+        <w:pStyle w:val="MediumGrid1-Accent21"/>
         <w:jc w:val="both"/>
         <w:rPr>
           <w:rStyle w:val="Bold"/>
@@ -2289,7 +2287,7 @@
     </w:p>
     <w:p>
       <w:pPr>
-        <w:pStyle w:val="MediumGrid1-Accent2"/>
+        <w:pStyle w:val="MediumGrid1-Accent21"/>
         <w:jc w:val="both"/>
         <w:rPr>
           <w:rStyle w:val="Bold"/>
@@ -2303,7 +2301,7 @@
     </w:p>
     <w:p>
       <w:pPr>
-        <w:pStyle w:val="MediumGrid1-Accent2"/>
+        <w:pStyle w:val="MediumGrid1-Accent21"/>
         <w:jc w:val="both"/>
         <w:rPr>
           <w:rStyle w:val="Bold"/>
@@ -2317,7 +2315,7 @@
     </w:p>
     <w:p>
       <w:pPr>
-        <w:pStyle w:val="MediumGrid1-Accent2"/>
+        <w:pStyle w:val="MediumGrid1-Accent21"/>
         <w:jc w:val="both"/>
         <w:rPr>
           <w:rStyle w:val="Bold"/>
@@ -2331,7 +2329,7 @@
     </w:p>
     <w:p>
       <w:pPr>
-        <w:pStyle w:val="MediumGrid1-Accent2"/>
+        <w:pStyle w:val="MediumGrid1-Accent21"/>
         <w:numPr>
           <w:ilvl w:val="0"/>
           <w:numId w:val="5"/>
@@ -2462,7 +2460,6 @@
           <w:b w:val="0"/>
           <w:szCs w:val="24"/>
         </w:rPr>
-        <w:lastRenderedPageBreak/>
         <w:t xml:space="preserve">The </w:t>
       </w:r>
       <w:r>
@@ -2527,7 +2524,7 @@
           <w:b w:val="0"/>
           <w:szCs w:val="24"/>
         </w:rPr>
-        <w:t>(date/Month/Year)</w:t>
+        <w:t>{DATE}</w:t>
       </w:r>
       <w:r>
         <w:rPr>
@@ -5005,8 +5002,8 @@
     <w:lsdException w:name="Plain Table 5" w:uiPriority="31" w:qFormat="1"/>
     <w:lsdException w:name="Grid Table Light" w:uiPriority="32" w:qFormat="1"/>
     <w:lsdException w:name="Grid Table 1 Light" w:uiPriority="33" w:qFormat="1"/>
-    <w:lsdException w:name="Grid Table 2" w:semiHidden="1" w:uiPriority="37" w:unhideWhenUsed="1"/>
-    <w:lsdException w:name="Grid Table 3" w:semiHidden="1" w:uiPriority="39" w:unhideWhenUsed="1" w:qFormat="1"/>
+    <w:lsdException w:name="Grid Table 2" w:uiPriority="37"/>
+    <w:lsdException w:name="Grid Table 3" w:uiPriority="39" w:qFormat="1"/>
     <w:lsdException w:name="Grid Table 4" w:uiPriority="49"/>
     <w:lsdException w:name="Grid Table 5 Dark" w:uiPriority="50"/>
     <w:lsdException w:name="Grid Table 6 Colorful" w:uiPriority="51"/>
@@ -5173,6 +5170,7 @@
   <w:style w:type="character" w:default="1" w:styleId="DefaultParagraphFont">
     <w:name w:val="Default Paragraph Font"/>
     <w:uiPriority w:val="1"/>
+    <w:semiHidden/>
     <w:unhideWhenUsed/>
   </w:style>
   <w:style w:type="table" w:default="1" w:styleId="TableNormal">
@@ -5180,7 +5178,6 @@
     <w:uiPriority w:val="99"/>
     <w:semiHidden/>
     <w:unhideWhenUsed/>
-    <w:qFormat/>
     <w:tblPr>
       <w:tblInd w:w="0" w:type="dxa"/>
       <w:tblCellMar>
@@ -5454,8 +5451,8 @@
       <w:lang w:val="en-GB"/>
     </w:rPr>
   </w:style>
-  <w:style w:type="paragraph" w:styleId="MediumGrid1-Accent2">
-    <w:name w:val="Medium Grid 1 Accent 2"/>
+  <w:style w:type="paragraph" w:customStyle="1" w:styleId="MediumGrid1-Accent21">
+    <w:name w:val="Medium Grid 1 - Accent 21"/>
     <w:basedOn w:val="Normal"/>
     <w:uiPriority w:val="72"/>
     <w:qFormat/>

</xml_diff>

<commit_message>
feedback: change local mou template
</commit_message>
<xml_diff>
--- a/mou_templates/mou_local.docx
+++ b/mou_templates/mou_local.docx
@@ -214,6 +214,13 @@
           <w:caps/>
         </w:rPr>
       </w:pPr>
+      <w:r>
+        <w:rPr>
+          <w:b/>
+          <w:caps/>
+        </w:rPr>
+        <w:t>{ORGANIZATION_NAME}</w:t>
+      </w:r>
     </w:p>
     <w:p>
       <w:pPr>
@@ -223,14 +230,15 @@
           <w:caps/>
         </w:rPr>
       </w:pPr>
-      <w:r>
+    </w:p>
+    <w:p>
+      <w:pPr>
+        <w:jc w:val="center"/>
         <w:rPr>
           <w:b/>
           <w:caps/>
-          <w:color w:val="FF0000"/>
-        </w:rPr>
-        <w:t>{ORGANIZATION_NAME}</w:t>
-      </w:r>
+        </w:rPr>
+      </w:pPr>
     </w:p>
     <w:p>
       <w:pPr>
@@ -414,6 +422,15 @@
     </w:p>
     <w:p>
       <w:pPr>
+        <w:jc w:val="both"/>
+        <w:rPr>
+          <w:b/>
+          <w:caps/>
+        </w:rPr>
+      </w:pPr>
+    </w:p>
+    <w:p>
+      <w:pPr>
         <w:jc w:val="center"/>
         <w:rPr>
           <w:b/>
@@ -441,7 +458,7 @@
     </w:p>
     <w:p>
       <w:pPr>
-        <w:jc w:val="both"/>
+        <w:jc w:val="center"/>
         <w:rPr>
           <w:b/>
           <w:caps/>
@@ -462,42 +479,6 @@
         <w:jc w:val="center"/>
         <w:rPr>
           <w:b/>
-          <w:caps/>
-        </w:rPr>
-      </w:pPr>
-    </w:p>
-    <w:p>
-      <w:pPr>
-        <w:jc w:val="center"/>
-        <w:rPr>
-          <w:b/>
-          <w:caps/>
-        </w:rPr>
-      </w:pPr>
-    </w:p>
-    <w:p>
-      <w:pPr>
-        <w:jc w:val="center"/>
-        <w:rPr>
-          <w:b/>
-          <w:caps/>
-        </w:rPr>
-      </w:pPr>
-    </w:p>
-    <w:p>
-      <w:pPr>
-        <w:jc w:val="center"/>
-        <w:rPr>
-          <w:b/>
-          <w:caps/>
-        </w:rPr>
-      </w:pPr>
-    </w:p>
-    <w:p>
-      <w:pPr>
-        <w:jc w:val="center"/>
-        <w:rPr>
-          <w:b/>
           <w:smallCaps/>
         </w:rPr>
       </w:pPr>
@@ -515,6 +496,22 @@
         </w:rPr>
         <w:t>emorandum of Understanding</w:t>
       </w:r>
+    </w:p>
+    <w:p>
+      <w:pPr>
+        <w:jc w:val="both"/>
+        <w:rPr>
+          <w:b/>
+        </w:rPr>
+      </w:pPr>
+    </w:p>
+    <w:p>
+      <w:pPr>
+        <w:jc w:val="both"/>
+        <w:rPr>
+          <w:b/>
+        </w:rPr>
+      </w:pPr>
     </w:p>
     <w:p>
       <w:pPr>
@@ -883,10 +880,7 @@
         <w:jc w:val="both"/>
       </w:pPr>
       <w:r>
-        <w:t xml:space="preserve">P.O. Box </w:t>
-      </w:r>
-      <w:r>
-        <w:t>{ORGANIZATION_PO_BOX}</w:t>
+        <w:t>P.O. Box {ORGANIZATION_PO_BOX}</w:t>
       </w:r>
     </w:p>
     <w:p>
@@ -926,33 +920,21 @@
         <w:rPr>
           <w:lang w:val="en-GB"/>
         </w:rPr>
-        <w:t xml:space="preserve">Fix and Mobile Phone: </w:t>
-      </w:r>
-      <w:r>
-        <w:rPr>
-          <w:lang w:val="en-GB"/>
-        </w:rPr>
-        <w:t>{ORGANIZATION_PHONE}</w:t>
-      </w:r>
-    </w:p>
-    <w:p>
-      <w:pPr>
-        <w:jc w:val="both"/>
-        <w:rPr>
-          <w:lang w:val="en-GB"/>
-        </w:rPr>
-      </w:pPr>
-      <w:r>
-        <w:rPr>
-          <w:lang w:val="en-GB"/>
-        </w:rPr>
-        <w:t xml:space="preserve">Address: </w:t>
-      </w:r>
-      <w:r>
-        <w:rPr>
-          <w:lang w:val="en-GB"/>
-        </w:rPr>
-        <w:t>{ORGANIZATION_ADDRESS}</w:t>
+        <w:t>Fix and Mobile Phone: {ORGANIZATION_PHONE}</w:t>
+      </w:r>
+    </w:p>
+    <w:p>
+      <w:pPr>
+        <w:jc w:val="both"/>
+        <w:rPr>
+          <w:lang w:val="en-GB"/>
+        </w:rPr>
+      </w:pPr>
+      <w:r>
+        <w:rPr>
+          <w:lang w:val="en-GB"/>
+        </w:rPr>
+        <w:t>Address: {ORGANIZATION_ADDRESS}</w:t>
       </w:r>
     </w:p>
     <w:p>
@@ -966,33 +948,21 @@
         <w:rPr>
           <w:lang w:val="en-GB"/>
         </w:rPr>
-        <w:t xml:space="preserve">Email: </w:t>
-      </w:r>
-      <w:r>
-        <w:rPr>
-          <w:lang w:val="en-GB"/>
-        </w:rPr>
-        <w:t>{ORGANIZATION_EMAIL}</w:t>
-      </w:r>
-    </w:p>
-    <w:p>
-      <w:pPr>
-        <w:jc w:val="both"/>
-        <w:rPr>
-          <w:lang w:val="en-GB"/>
-        </w:rPr>
-      </w:pPr>
-      <w:r>
-        <w:rPr>
-          <w:lang w:val="en-GB"/>
-        </w:rPr>
-        <w:t>Website:</w:t>
-      </w:r>
-      <w:r>
-        <w:rPr>
-          <w:lang w:val="en-GB"/>
-        </w:rPr>
-        <w:t xml:space="preserve"> {ORGANIZATION_WEBSITE}</w:t>
+        <w:t>Email: {ORGANIZATION_EMAIL}</w:t>
+      </w:r>
+    </w:p>
+    <w:p>
+      <w:pPr>
+        <w:jc w:val="both"/>
+        <w:rPr>
+          <w:lang w:val="en-GB"/>
+        </w:rPr>
+      </w:pPr>
+      <w:r>
+        <w:rPr>
+          <w:lang w:val="en-GB"/>
+        </w:rPr>
+        <w:t>Website: {ORGANIZATION_WEBSITE}</w:t>
       </w:r>
     </w:p>
     <w:p>
@@ -1230,6 +1200,7 @@
         <w:jc w:val="both"/>
       </w:pPr>
       <w:r>
+        <w:lastRenderedPageBreak/>
         <w:t>T</w:t>
       </w:r>
       <w:r>
@@ -1248,13 +1219,7 @@
         <w:rPr>
           <w:lang w:val="en-GB"/>
         </w:rPr>
-        <w:t xml:space="preserve">; both parties agree </w:t>
-      </w:r>
-      <w:r>
-        <w:rPr>
-          <w:lang w:val="en-GB"/>
-        </w:rPr>
-        <w:t xml:space="preserve">to establish a </w:t>
+        <w:t xml:space="preserve">; both parties agree to establish a </w:t>
       </w:r>
       <w:r>
         <w:rPr>
@@ -1286,7 +1251,7 @@
     </w:p>
     <w:p>
       <w:pPr>
-        <w:pStyle w:val="MediumGrid1-Accent21"/>
+        <w:pStyle w:val="MediumGrid1-Accent2"/>
         <w:numPr>
           <w:ilvl w:val="0"/>
           <w:numId w:val="5"/>
@@ -1437,42 +1402,36 @@
       <w:r>
         <w:rPr>
           <w:bCs/>
-          <w:highlight w:val="cyan"/>
         </w:rPr>
         <w:t>one</w:t>
       </w:r>
       <w:r>
         <w:rPr>
           <w:bCs/>
-          <w:highlight w:val="cyan"/>
         </w:rPr>
         <w:t xml:space="preserve"> (</w:t>
       </w:r>
       <w:r>
         <w:rPr>
           <w:bCs/>
-          <w:highlight w:val="cyan"/>
         </w:rPr>
         <w:t>1</w:t>
       </w:r>
       <w:r>
         <w:rPr>
           <w:bCs/>
-          <w:highlight w:val="cyan"/>
         </w:rPr>
         <w:t>)</w:t>
       </w:r>
       <w:r>
         <w:rPr>
           <w:bCs/>
-          <w:highlight w:val="cyan"/>
         </w:rPr>
         <w:t xml:space="preserve"> </w:t>
       </w:r>
       <w:r>
         <w:rPr>
           <w:bCs/>
-          <w:highlight w:val="cyan"/>
         </w:rPr>
         <w:t>year</w:t>
       </w:r>
@@ -1608,10 +1567,7 @@
         <w:t xml:space="preserve">{OVERALL_GOAL} </w:t>
       </w:r>
       <w:r>
-        <w:t>and specific objectives are:</w:t>
-      </w:r>
-      <w:r>
-        <w:t xml:space="preserve"> </w:t>
+        <w:t xml:space="preserve">and specific objectives are: </w:t>
       </w:r>
     </w:p>
     <w:p>
@@ -1803,7 +1759,7 @@
         <w:t xml:space="preserve">ational Health Policy where </w:t>
       </w:r>
       <w:r>
-        <w:t xml:space="preserve">{ACTIVITY_DOMAINS} </w:t>
+        <w:t xml:space="preserve">{ACTIVITIES_DOMAINS} </w:t>
       </w:r>
       <w:r>
         <w:t>are concerned.</w:t>
@@ -1816,12 +1772,12 @@
           <w:numId w:val="16"/>
         </w:numPr>
         <w:jc w:val="both"/>
-        <w:rPr>
-          <w:highlight w:val="cyan"/>
-        </w:rPr>
-      </w:pPr>
-      <w:r>
-        <w:t xml:space="preserve">To support the dissemination of information regarding the program </w:t>
+      </w:pPr>
+      <w:r>
+        <w:t>To support</w:t>
+      </w:r>
+      <w:r>
+        <w:t xml:space="preserve"> the dissemination of information regarding the program </w:t>
       </w:r>
     </w:p>
     <w:p>
@@ -1836,7 +1792,10 @@
         <w:t xml:space="preserve">To assigns Partners/SWAp Coordination Desk to provide to </w:t>
       </w:r>
       <w:r>
-        <w:t xml:space="preserve">{ORGANIZATION_NAME} </w:t>
+        <w:t>{ORGANIZATION_NAME}</w:t>
+      </w:r>
+      <w:r>
+        <w:t xml:space="preserve"> </w:t>
       </w:r>
       <w:r>
         <w:t>with the necessary administrative support related to the program/project or activities.</w:t>
@@ -1922,10 +1881,6 @@
         <w:t xml:space="preserve">Responsibilities of </w:t>
       </w:r>
       <w:r>
-        <w:rPr>
-          <w:bCs/>
-          <w:szCs w:val="24"/>
-        </w:rPr>
         <w:t>{ORGANIZATION_NAME}</w:t>
       </w:r>
     </w:p>
@@ -1960,43 +1915,43 @@
     </w:p>
     <w:p>
       <w:pPr>
+        <w:pStyle w:val="MediumGrid1-Accent2"/>
+        <w:jc w:val="both"/>
+      </w:pPr>
+    </w:p>
+    <w:p>
+      <w:pPr>
         <w:pStyle w:val="MediumGrid1-Accent21"/>
         <w:ind w:left="0"/>
         <w:jc w:val="both"/>
       </w:pPr>
-    </w:p>
-    <w:p>
-      <w:pPr>
-        <w:pStyle w:val="MediumGrid1-Accent21"/>
+      <w:r>
+        <w:t>{PARTY_RESPONSIBILITIES}</w:t>
+      </w:r>
+    </w:p>
+    <w:p>
+      <w:pPr>
+        <w:pStyle w:val="MediumGrid1-Accent2"/>
         <w:ind w:left="0"/>
         <w:jc w:val="both"/>
       </w:pPr>
       <w:r>
-        <w:t>{PARTY_RESPONSIBILITIES}</w:t>
-      </w:r>
-    </w:p>
-    <w:p>
-      <w:pPr>
-        <w:pStyle w:val="MediumGrid1-Accent21"/>
-        <w:ind w:left="0"/>
-        <w:jc w:val="both"/>
-      </w:pPr>
-      <w:r>
-        <w:t xml:space="preserve">{ORGANIZATION_NAME} </w:t>
-      </w:r>
-      <w:r>
-        <w:t xml:space="preserve">agrees to submit regular financial and activity reports on progress made, challenges and future projections to the Ministry of Health’s Partners/SWAp Coordination and affiliated institutions informed about its projects, as well as reporting in HRTT. </w:t>
-      </w:r>
-    </w:p>
-    <w:p>
-      <w:pPr>
-        <w:pStyle w:val="MediumGrid1-Accent21"/>
-        <w:jc w:val="both"/>
-      </w:pPr>
-    </w:p>
-    <w:p>
-      <w:pPr>
-        <w:pStyle w:val="MediumGrid1-Accent21"/>
+        <w:lastRenderedPageBreak/>
+        <w:t>{ORGANIZATION_NAME}</w:t>
+      </w:r>
+      <w:r>
+        <w:t xml:space="preserve"> agrees to submit regular financial and activity reports on progress made, challenges and future projections to the Ministry of Health’s Partners/SWAp Coordination and affiliated institutions informed about its projects, as well as reporting in HRTT. </w:t>
+      </w:r>
+    </w:p>
+    <w:p>
+      <w:pPr>
+        <w:pStyle w:val="MediumGrid1-Accent2"/>
+        <w:jc w:val="both"/>
+      </w:pPr>
+    </w:p>
+    <w:p>
+      <w:pPr>
+        <w:pStyle w:val="MediumGrid1-Accent2"/>
         <w:numPr>
           <w:ilvl w:val="0"/>
           <w:numId w:val="5"/>
@@ -2018,7 +1973,7 @@
     </w:p>
     <w:p>
       <w:pPr>
-        <w:pStyle w:val="MediumGrid1-Accent21"/>
+        <w:pStyle w:val="MediumGrid1-Accent2"/>
         <w:contextualSpacing/>
         <w:jc w:val="both"/>
         <w:rPr>
@@ -2234,10 +2189,7 @@
         <w:t>{ORGANIZATION_NAME}</w:t>
       </w:r>
       <w:r>
-        <w:t xml:space="preserve"> </w:t>
-      </w:r>
-      <w:r>
-        <w:t xml:space="preserve">does not register </w:t>
+        <w:t xml:space="preserve"> does not register </w:t>
       </w:r>
       <w:r>
         <w:t xml:space="preserve">or renew its registration certificate </w:t>
@@ -2259,7 +2211,7 @@
     </w:p>
     <w:p>
       <w:pPr>
-        <w:pStyle w:val="MediumGrid1-Accent21"/>
+        <w:pStyle w:val="MediumGrid1-Accent2"/>
         <w:jc w:val="both"/>
         <w:rPr>
           <w:rStyle w:val="Bold"/>
@@ -2273,7 +2225,7 @@
     </w:p>
     <w:p>
       <w:pPr>
-        <w:pStyle w:val="MediumGrid1-Accent21"/>
+        <w:pStyle w:val="MediumGrid1-Accent2"/>
         <w:jc w:val="both"/>
         <w:rPr>
           <w:rStyle w:val="Bold"/>
@@ -2287,7 +2239,7 @@
     </w:p>
     <w:p>
       <w:pPr>
-        <w:pStyle w:val="MediumGrid1-Accent21"/>
+        <w:pStyle w:val="MediumGrid1-Accent2"/>
         <w:jc w:val="both"/>
         <w:rPr>
           <w:rStyle w:val="Bold"/>
@@ -2301,7 +2253,7 @@
     </w:p>
     <w:p>
       <w:pPr>
-        <w:pStyle w:val="MediumGrid1-Accent21"/>
+        <w:pStyle w:val="MediumGrid1-Accent2"/>
         <w:jc w:val="both"/>
         <w:rPr>
           <w:rStyle w:val="Bold"/>
@@ -2315,7 +2267,7 @@
     </w:p>
     <w:p>
       <w:pPr>
-        <w:pStyle w:val="MediumGrid1-Accent21"/>
+        <w:pStyle w:val="MediumGrid1-Accent2"/>
         <w:jc w:val="both"/>
         <w:rPr>
           <w:rStyle w:val="Bold"/>
@@ -2329,7 +2281,7 @@
     </w:p>
     <w:p>
       <w:pPr>
-        <w:pStyle w:val="MediumGrid1-Accent21"/>
+        <w:pStyle w:val="MediumGrid1-Accent2"/>
         <w:numPr>
           <w:ilvl w:val="0"/>
           <w:numId w:val="5"/>
@@ -2460,6 +2412,7 @@
           <w:b w:val="0"/>
           <w:szCs w:val="24"/>
         </w:rPr>
+        <w:lastRenderedPageBreak/>
         <w:t xml:space="preserve">The </w:t>
       </w:r>
       <w:r>
@@ -2625,7 +2578,7 @@
           <w:b/>
           <w:bCs/>
         </w:rPr>
-        <w:t xml:space="preserve">Government of </w:t>
+        <w:t>Government of Rwanda</w:t>
       </w:r>
       <w:r>
         <w:rPr>
@@ -2633,7 +2586,7 @@
           <w:b/>
           <w:bCs/>
         </w:rPr>
-        <w:t>Rwanda</w:t>
+        <w:t xml:space="preserve">                                    </w:t>
       </w:r>
       <w:r>
         <w:rPr>
@@ -2641,7 +2594,7 @@
           <w:b/>
           <w:bCs/>
         </w:rPr>
-        <w:t xml:space="preserve">                                    </w:t>
+        <w:t xml:space="preserve">and          </w:t>
       </w:r>
       <w:r>
         <w:rPr>
@@ -2649,23 +2602,7 @@
           <w:b/>
           <w:bCs/>
         </w:rPr>
-        <w:t xml:space="preserve">and          </w:t>
-      </w:r>
-      <w:r>
-        <w:rPr>
-          <w:rStyle w:val="description"/>
-          <w:b/>
-          <w:bCs/>
-        </w:rPr>
-        <w:t xml:space="preserve">       On Behalf of </w:t>
-      </w:r>
-      <w:r>
-        <w:rPr>
-          <w:rStyle w:val="description"/>
-          <w:b/>
-          <w:bCs/>
-        </w:rPr>
-        <w:t>{ORGANIZATION_NAME}</w:t>
+        <w:t xml:space="preserve">       On Behalf of {ORGANIZATION_NAME}</w:t>
       </w:r>
     </w:p>
     <w:p>
@@ -2738,13 +2675,6 @@
           <w:bCs/>
         </w:rPr>
         <w:tab/>
-      </w:r>
-      <w:r>
-        <w:rPr>
-          <w:rStyle w:val="description"/>
-          <w:b/>
-          <w:bCs/>
-        </w:rPr>
         <w:t xml:space="preserve">    </w:t>
       </w:r>
       <w:r>
@@ -2927,6 +2857,35 @@
           <w:lang w:val="en-GB"/>
         </w:rPr>
       </w:pPr>
+    </w:p>
+    <w:p>
+      <w:pPr>
+        <w:ind w:left="-180"/>
+        <w:jc w:val="both"/>
+        <w:rPr>
+          <w:b/>
+          <w:lang w:val="en-GB"/>
+        </w:rPr>
+      </w:pPr>
+      <w:r>
+        <w:rPr>
+          <w:b/>
+          <w:lang w:val="en-GB"/>
+        </w:rPr>
+        <w:tab/>
+      </w:r>
+      <w:r>
+        <w:rPr>
+          <w:lang w:val="en-GB"/>
+        </w:rPr>
+        <w:tab/>
+      </w:r>
+      <w:r>
+        <w:rPr>
+          <w:lang w:val="en-GB"/>
+        </w:rPr>
+        <w:tab/>
+      </w:r>
     </w:p>
     <w:sectPr>
       <w:footerReference w:type="default" r:id="rId9"/>
@@ -5002,8 +4961,8 @@
     <w:lsdException w:name="Plain Table 5" w:uiPriority="31" w:qFormat="1"/>
     <w:lsdException w:name="Grid Table Light" w:uiPriority="32" w:qFormat="1"/>
     <w:lsdException w:name="Grid Table 1 Light" w:uiPriority="33" w:qFormat="1"/>
-    <w:lsdException w:name="Grid Table 2" w:uiPriority="37"/>
-    <w:lsdException w:name="Grid Table 3" w:uiPriority="39" w:qFormat="1"/>
+    <w:lsdException w:name="Grid Table 2" w:semiHidden="1" w:uiPriority="37" w:unhideWhenUsed="1"/>
+    <w:lsdException w:name="Grid Table 3" w:semiHidden="1" w:uiPriority="39" w:unhideWhenUsed="1" w:qFormat="1"/>
     <w:lsdException w:name="Grid Table 4" w:uiPriority="49"/>
     <w:lsdException w:name="Grid Table 5 Dark" w:uiPriority="50"/>
     <w:lsdException w:name="Grid Table 6 Colorful" w:uiPriority="51"/>
@@ -5178,6 +5137,7 @@
     <w:uiPriority w:val="99"/>
     <w:semiHidden/>
     <w:unhideWhenUsed/>
+    <w:qFormat/>
     <w:tblPr>
       <w:tblInd w:w="0" w:type="dxa"/>
       <w:tblCellMar>
@@ -5451,8 +5411,8 @@
       <w:lang w:val="en-GB"/>
     </w:rPr>
   </w:style>
-  <w:style w:type="paragraph" w:customStyle="1" w:styleId="MediumGrid1-Accent21">
-    <w:name w:val="Medium Grid 1 - Accent 21"/>
+  <w:style w:type="paragraph" w:styleId="MediumGrid1-Accent2">
+    <w:name w:val="Medium Grid 1 Accent 2"/>
     <w:basedOn w:val="Normal"/>
     <w:uiPriority w:val="72"/>
     <w:qFormat/>
@@ -5680,13 +5640,23 @@
       <w:szCs w:val="24"/>
     </w:rPr>
   </w:style>
+  <w:style w:type="paragraph" w:customStyle="1" w:styleId="MediumGrid1-Accent21">
+    <w:name w:val="Medium Grid 1 - Accent 21"/>
+    <w:basedOn w:val="Normal"/>
+    <w:uiPriority w:val="72"/>
+    <w:qFormat/>
+    <w:rsid w:val="00E9241D"/>
+    <w:pPr>
+      <w:ind w:left="720"/>
+    </w:pPr>
+  </w:style>
   <w:style w:type="paragraph" w:styleId="BodyText">
     <w:name w:val="Body Text"/>
     <w:basedOn w:val="Normal"/>
     <w:link w:val="BodyTextChar"/>
     <w:uiPriority w:val="1"/>
     <w:qFormat/>
-    <w:rsid w:val="0099050B"/>
+    <w:rsid w:val="00E9241D"/>
     <w:pPr>
       <w:widowControl w:val="0"/>
       <w:autoSpaceDE w:val="0"/>
@@ -5698,7 +5668,7 @@
     <w:basedOn w:val="DefaultParagraphFont"/>
     <w:link w:val="BodyText"/>
     <w:uiPriority w:val="1"/>
-    <w:rsid w:val="0099050B"/>
+    <w:rsid w:val="00E9241D"/>
     <w:rPr>
       <w:rFonts w:ascii="Times New Roman" w:eastAsia="Times New Roman" w:hAnsi="Times New Roman"/>
       <w:sz w:val="24"/>

</xml_diff>